<commit_message>
fix: security and data-flow defects - research API, auth callback, chat, and URL initialization
HIGH SEVERITY (3):
- Research API: path traversal via unvalidated locale/ID + no containment check
- Auth Callback: query parameters lost on locale redirect
- Chat Quota: confirm/release RPC results not checked, silent quota corruption

MEDIUM SEVERITY (2):
- Shared Links: URL write before read race condition deletes ?sage=
- Chat Requests: message length, locale, sessionId not validated

Changes:
- nextjs-app/app/api/research/[id]/route.ts: validate locale/ID, enforce path containment
- nextjs-app/middleware.ts: skip /auth routes, preserve query params
- nextjs-app/components/layout/AppShell.tsx: add sageMap.size dependency to prevent URL race
- nextjs-app/app/api/chat/route.ts: validate input, check all database result codes

Co-Authored-By: Claude Haiku 4.5 <noreply@anthropic.com>
</commit_message>
<xml_diff>
--- a/data/The Life and Intellectual Legacy of Rabbi Saadia Chouraqui_ A Synthesis of Science, Rabbinics, and Rationalism in 17th-Century Tlemcen.docx
+++ b/data/The Life and Intellectual Legacy of Rabbi Saadia Chouraqui_ A Synthesis of Science, Rabbinics, and Rationalism in 17th-Century Tlemcen.docx
@@ -2345,7 +2345,7 @@
     <w:tbl>
       <w:tblPr>
         <w:tblStyle w:val="Table1"/>
-        <w:tblW w:w="11160.0" w:type="dxa"/>
+        <w:tblW w:w="11145.0" w:type="dxa"/>
         <w:jc w:val="left"/>
         <w:tblBorders>
           <w:top w:color="000000" w:space="0" w:sz="0" w:val="nil"/>
@@ -2361,12 +2361,12 @@
       <w:tblGrid>
         <w:gridCol w:w="2030"/>
         <w:gridCol w:w="3425"/>
-        <w:gridCol w:w="5705"/>
+        <w:gridCol w:w="5690"/>
         <w:tblGridChange w:id="0">
           <w:tblGrid>
             <w:gridCol w:w="2030"/>
             <w:gridCol w:w="3425"/>
-            <w:gridCol w:w="5705"/>
+            <w:gridCol w:w="5690"/>
           </w:tblGrid>
         </w:tblGridChange>
       </w:tblGrid>
@@ -3472,7 +3472,7 @@
       <w:pPr>
         <w:numPr>
           <w:ilvl w:val="0"/>
-          <w:numId w:val="2"/>
+          <w:numId w:val="1"/>
         </w:numPr>
         <w:spacing w:after="0" w:afterAutospacing="0" w:lineRule="auto"/>
         <w:ind w:left="720" w:hanging="360"/>
@@ -3510,7 +3510,7 @@
       <w:pPr>
         <w:numPr>
           <w:ilvl w:val="0"/>
-          <w:numId w:val="2"/>
+          <w:numId w:val="1"/>
         </w:numPr>
         <w:spacing w:after="0" w:afterAutospacing="0" w:lineRule="auto"/>
         <w:ind w:left="720" w:hanging="360"/>
@@ -3572,7 +3572,7 @@
       <w:pPr>
         <w:numPr>
           <w:ilvl w:val="0"/>
-          <w:numId w:val="2"/>
+          <w:numId w:val="1"/>
         </w:numPr>
         <w:spacing w:after="180" w:lineRule="auto"/>
         <w:ind w:left="720" w:hanging="360"/>
@@ -4189,7 +4189,7 @@
     <w:tbl>
       <w:tblPr>
         <w:tblStyle w:val="Table2"/>
-        <w:tblW w:w="11175.0" w:type="dxa"/>
+        <w:tblW w:w="11130.0" w:type="dxa"/>
         <w:jc w:val="left"/>
         <w:tblBorders>
           <w:top w:color="000000" w:space="0" w:sz="0" w:val="nil"/>
@@ -4204,13 +4204,13 @@
       </w:tblPr>
       <w:tblGrid>
         <w:gridCol w:w="2585"/>
-        <w:gridCol w:w="2840"/>
-        <w:gridCol w:w="5750"/>
+        <w:gridCol w:w="2825"/>
+        <w:gridCol w:w="5720"/>
         <w:tblGridChange w:id="0">
           <w:tblGrid>
             <w:gridCol w:w="2585"/>
-            <w:gridCol w:w="2840"/>
-            <w:gridCol w:w="5750"/>
+            <w:gridCol w:w="2825"/>
+            <w:gridCol w:w="5720"/>
           </w:tblGrid>
         </w:tblGridChange>
       </w:tblGrid>
@@ -5005,7 +5005,7 @@
       <w:pPr>
         <w:numPr>
           <w:ilvl w:val="0"/>
-          <w:numId w:val="1"/>
+          <w:numId w:val="2"/>
         </w:numPr>
         <w:spacing w:after="0" w:afterAutospacing="0" w:lineRule="auto"/>
         <w:ind w:left="720" w:hanging="360"/>
@@ -5043,7 +5043,7 @@
       <w:pPr>
         <w:numPr>
           <w:ilvl w:val="0"/>
-          <w:numId w:val="1"/>
+          <w:numId w:val="2"/>
         </w:numPr>
         <w:spacing w:after="0" w:afterAutospacing="0" w:lineRule="auto"/>
         <w:ind w:left="720" w:hanging="360"/>
@@ -5081,7 +5081,7 @@
       <w:pPr>
         <w:numPr>
           <w:ilvl w:val="0"/>
-          <w:numId w:val="1"/>
+          <w:numId w:val="2"/>
         </w:numPr>
         <w:spacing w:after="180" w:lineRule="auto"/>
         <w:ind w:left="720" w:hanging="360"/>
@@ -5306,7 +5306,7 @@
     <w:tbl>
       <w:tblPr>
         <w:tblStyle w:val="Table3"/>
-        <w:tblW w:w="10975.0" w:type="dxa"/>
+        <w:tblW w:w="10945.0" w:type="dxa"/>
         <w:jc w:val="left"/>
         <w:tblBorders>
           <w:top w:color="000000" w:space="0" w:sz="0" w:val="nil"/>
@@ -5321,11 +5321,11 @@
       </w:tblPr>
       <w:tblGrid>
         <w:gridCol w:w="2675"/>
-        <w:gridCol w:w="8300"/>
+        <w:gridCol w:w="8270"/>
         <w:tblGridChange w:id="0">
           <w:tblGrid>
             <w:gridCol w:w="2675"/>
-            <w:gridCol w:w="8300"/>
+            <w:gridCol w:w="8270"/>
           </w:tblGrid>
         </w:tblGridChange>
       </w:tblGrid>
@@ -6055,7 +6055,7 @@
     <w:tbl>
       <w:tblPr>
         <w:tblStyle w:val="Table4"/>
-        <w:tblW w:w="11175.0" w:type="dxa"/>
+        <w:tblW w:w="11130.0" w:type="dxa"/>
         <w:jc w:val="left"/>
         <w:tblBorders>
           <w:top w:color="000000" w:space="0" w:sz="0" w:val="nil"/>
@@ -6069,14 +6069,14 @@
         <w:tblLook w:val="0600"/>
       </w:tblPr>
       <w:tblGrid>
-        <w:gridCol w:w="2990"/>
+        <w:gridCol w:w="2975"/>
         <w:gridCol w:w="2885"/>
-        <w:gridCol w:w="5300"/>
+        <w:gridCol w:w="5270"/>
         <w:tblGridChange w:id="0">
           <w:tblGrid>
-            <w:gridCol w:w="2990"/>
+            <w:gridCol w:w="2975"/>
             <w:gridCol w:w="2885"/>
-            <w:gridCol w:w="5300"/>
+            <w:gridCol w:w="5270"/>
           </w:tblGrid>
         </w:tblGridChange>
       </w:tblGrid>
@@ -7796,6 +7796,8 @@
     </w:p>
     <w:p>
       <w:pPr>
+        <w:spacing w:after="180" w:lineRule="auto"/>
+        <w:ind w:left="720" w:firstLine="0"/>
         <w:rPr/>
       </w:pPr>
       <w:r>
@@ -7826,6 +7828,126 @@
 <file path=word/numbering.xml><?xml version="1.0" encoding="utf-8"?>
 <w:numbering xmlns:mc="http://schemas.openxmlformats.org/markup-compatibility/2006" xmlns:o="urn:schemas-microsoft-com:office:office" xmlns:r="http://schemas.openxmlformats.org/officeDocument/2006/relationships" xmlns:m="http://schemas.openxmlformats.org/officeDocument/2006/math" xmlns:v="urn:schemas-microsoft-com:vml" xmlns:wp="http://schemas.openxmlformats.org/drawingml/2006/wordprocessingDrawing" xmlns:w10="urn:schemas-microsoft-com:office:word" xmlns:w="http://schemas.openxmlformats.org/wordprocessingml/2006/main" xmlns:wne="http://schemas.microsoft.com/office/word/2006/wordml" xmlns:sl="http://schemas.openxmlformats.org/schemaLibrary/2006/main" xmlns:a="http://schemas.openxmlformats.org/drawingml/2006/main" xmlns:pic="http://schemas.openxmlformats.org/drawingml/2006/picture" xmlns:c="http://schemas.openxmlformats.org/drawingml/2006/chart" xmlns:lc="http://schemas.openxmlformats.org/drawingml/2006/lockedCanvas" xmlns:dgm="http://schemas.openxmlformats.org/drawingml/2006/diagram" xmlns:wps="http://schemas.microsoft.com/office/word/2010/wordprocessingShape" xmlns:wpg="http://schemas.microsoft.com/office/word/2010/wordprocessingGroup" xmlns:w14="http://schemas.microsoft.com/office/word/2010/wordml" xmlns:w15="http://schemas.microsoft.com/office/word/2012/wordml" xmlns:w16="http://schemas.microsoft.com/office/word/2018/wordml" xmlns:w16cex="http://schemas.microsoft.com/office/word/2018/wordml/cex" xmlns:w16cid="http://schemas.microsoft.com/office/word/2016/wordml/cid" xmlns="http://schemas.microsoft.com/office/tasks/2019/documenttasks" xmlns:cr="http://schemas.microsoft.com/office/comments/2020/reactions">
   <w:abstractNum w:abstractNumId="1">
+    <w:lvl w:ilvl="0">
+      <w:start w:val="1"/>
+      <w:numFmt w:val="bullet"/>
+      <w:lvlText w:val="●"/>
+      <w:lvlJc w:val="left"/>
+      <w:pPr>
+        <w:ind w:left="720" w:hanging="360"/>
+      </w:pPr>
+      <w:rPr>
+        <w:rFonts w:ascii="Times New Roman" w:cs="Times New Roman" w:eastAsia="Times New Roman" w:hAnsi="Times New Roman"/>
+        <w:b w:val="0"/>
+        <w:bCs w:val="0"/>
+        <w:i w:val="0"/>
+        <w:iCs w:val="0"/>
+        <w:smallCaps w:val="0"/>
+        <w:color w:val="1b1b1c"/>
+        <w:sz w:val="21"/>
+        <w:szCs w:val="21"/>
+        <w:highlight w:val="white"/>
+        <w:u w:val="none"/>
+      </w:rPr>
+    </w:lvl>
+    <w:lvl w:ilvl="1">
+      <w:start w:val="1"/>
+      <w:numFmt w:val="bullet"/>
+      <w:lvlText w:val="○"/>
+      <w:lvlJc w:val="left"/>
+      <w:pPr>
+        <w:ind w:left="1440" w:hanging="360"/>
+      </w:pPr>
+      <w:rPr>
+        <w:u w:val="none"/>
+      </w:rPr>
+    </w:lvl>
+    <w:lvl w:ilvl="2">
+      <w:start w:val="1"/>
+      <w:numFmt w:val="bullet"/>
+      <w:lvlText w:val="■"/>
+      <w:lvlJc w:val="left"/>
+      <w:pPr>
+        <w:ind w:left="2160" w:hanging="360"/>
+      </w:pPr>
+      <w:rPr>
+        <w:u w:val="none"/>
+      </w:rPr>
+    </w:lvl>
+    <w:lvl w:ilvl="3">
+      <w:start w:val="1"/>
+      <w:numFmt w:val="bullet"/>
+      <w:lvlText w:val="●"/>
+      <w:lvlJc w:val="left"/>
+      <w:pPr>
+        <w:ind w:left="2880" w:hanging="360"/>
+      </w:pPr>
+      <w:rPr>
+        <w:u w:val="none"/>
+      </w:rPr>
+    </w:lvl>
+    <w:lvl w:ilvl="4">
+      <w:start w:val="1"/>
+      <w:numFmt w:val="bullet"/>
+      <w:lvlText w:val="○"/>
+      <w:lvlJc w:val="left"/>
+      <w:pPr>
+        <w:ind w:left="3600" w:hanging="360"/>
+      </w:pPr>
+      <w:rPr>
+        <w:u w:val="none"/>
+      </w:rPr>
+    </w:lvl>
+    <w:lvl w:ilvl="5">
+      <w:start w:val="1"/>
+      <w:numFmt w:val="bullet"/>
+      <w:lvlText w:val="■"/>
+      <w:lvlJc w:val="left"/>
+      <w:pPr>
+        <w:ind w:left="4320" w:hanging="360"/>
+      </w:pPr>
+      <w:rPr>
+        <w:u w:val="none"/>
+      </w:rPr>
+    </w:lvl>
+    <w:lvl w:ilvl="6">
+      <w:start w:val="1"/>
+      <w:numFmt w:val="bullet"/>
+      <w:lvlText w:val="●"/>
+      <w:lvlJc w:val="left"/>
+      <w:pPr>
+        <w:ind w:left="5040" w:hanging="360"/>
+      </w:pPr>
+      <w:rPr>
+        <w:u w:val="none"/>
+      </w:rPr>
+    </w:lvl>
+    <w:lvl w:ilvl="7">
+      <w:start w:val="1"/>
+      <w:numFmt w:val="bullet"/>
+      <w:lvlText w:val="○"/>
+      <w:lvlJc w:val="left"/>
+      <w:pPr>
+        <w:ind w:left="5760" w:hanging="360"/>
+      </w:pPr>
+      <w:rPr>
+        <w:u w:val="none"/>
+      </w:rPr>
+    </w:lvl>
+    <w:lvl w:ilvl="8">
+      <w:start w:val="1"/>
+      <w:numFmt w:val="bullet"/>
+      <w:lvlText w:val="■"/>
+      <w:lvlJc w:val="left"/>
+      <w:pPr>
+        <w:ind w:left="6480" w:hanging="360"/>
+      </w:pPr>
+      <w:rPr>
+        <w:u w:val="none"/>
+      </w:rPr>
+    </w:lvl>
+  </w:abstractNum>
+  <w:abstractNum w:abstractNumId="2">
     <w:lvl w:ilvl="0">
       <w:start w:val="1"/>
       <w:numFmt w:val="decimal"/>
@@ -7936,126 +8058,6 @@
       <w:start w:val="1"/>
       <w:numFmt w:val="lowerRoman"/>
       <w:lvlText w:val="%9."/>
-      <w:lvlJc w:val="left"/>
-      <w:pPr>
-        <w:ind w:left="6480" w:hanging="360"/>
-      </w:pPr>
-      <w:rPr>
-        <w:u w:val="none"/>
-      </w:rPr>
-    </w:lvl>
-  </w:abstractNum>
-  <w:abstractNum w:abstractNumId="2">
-    <w:lvl w:ilvl="0">
-      <w:start w:val="1"/>
-      <w:numFmt w:val="bullet"/>
-      <w:lvlText w:val="●"/>
-      <w:lvlJc w:val="left"/>
-      <w:pPr>
-        <w:ind w:left="720" w:hanging="360"/>
-      </w:pPr>
-      <w:rPr>
-        <w:rFonts w:ascii="Times New Roman" w:cs="Times New Roman" w:eastAsia="Times New Roman" w:hAnsi="Times New Roman"/>
-        <w:b w:val="0"/>
-        <w:bCs w:val="0"/>
-        <w:i w:val="0"/>
-        <w:iCs w:val="0"/>
-        <w:smallCaps w:val="0"/>
-        <w:color w:val="1b1b1c"/>
-        <w:sz w:val="21"/>
-        <w:szCs w:val="21"/>
-        <w:highlight w:val="white"/>
-        <w:u w:val="none"/>
-      </w:rPr>
-    </w:lvl>
-    <w:lvl w:ilvl="1">
-      <w:start w:val="1"/>
-      <w:numFmt w:val="bullet"/>
-      <w:lvlText w:val="○"/>
-      <w:lvlJc w:val="left"/>
-      <w:pPr>
-        <w:ind w:left="1440" w:hanging="360"/>
-      </w:pPr>
-      <w:rPr>
-        <w:u w:val="none"/>
-      </w:rPr>
-    </w:lvl>
-    <w:lvl w:ilvl="2">
-      <w:start w:val="1"/>
-      <w:numFmt w:val="bullet"/>
-      <w:lvlText w:val="■"/>
-      <w:lvlJc w:val="left"/>
-      <w:pPr>
-        <w:ind w:left="2160" w:hanging="360"/>
-      </w:pPr>
-      <w:rPr>
-        <w:u w:val="none"/>
-      </w:rPr>
-    </w:lvl>
-    <w:lvl w:ilvl="3">
-      <w:start w:val="1"/>
-      <w:numFmt w:val="bullet"/>
-      <w:lvlText w:val="●"/>
-      <w:lvlJc w:val="left"/>
-      <w:pPr>
-        <w:ind w:left="2880" w:hanging="360"/>
-      </w:pPr>
-      <w:rPr>
-        <w:u w:val="none"/>
-      </w:rPr>
-    </w:lvl>
-    <w:lvl w:ilvl="4">
-      <w:start w:val="1"/>
-      <w:numFmt w:val="bullet"/>
-      <w:lvlText w:val="○"/>
-      <w:lvlJc w:val="left"/>
-      <w:pPr>
-        <w:ind w:left="3600" w:hanging="360"/>
-      </w:pPr>
-      <w:rPr>
-        <w:u w:val="none"/>
-      </w:rPr>
-    </w:lvl>
-    <w:lvl w:ilvl="5">
-      <w:start w:val="1"/>
-      <w:numFmt w:val="bullet"/>
-      <w:lvlText w:val="■"/>
-      <w:lvlJc w:val="left"/>
-      <w:pPr>
-        <w:ind w:left="4320" w:hanging="360"/>
-      </w:pPr>
-      <w:rPr>
-        <w:u w:val="none"/>
-      </w:rPr>
-    </w:lvl>
-    <w:lvl w:ilvl="6">
-      <w:start w:val="1"/>
-      <w:numFmt w:val="bullet"/>
-      <w:lvlText w:val="●"/>
-      <w:lvlJc w:val="left"/>
-      <w:pPr>
-        <w:ind w:left="5040" w:hanging="360"/>
-      </w:pPr>
-      <w:rPr>
-        <w:u w:val="none"/>
-      </w:rPr>
-    </w:lvl>
-    <w:lvl w:ilvl="7">
-      <w:start w:val="1"/>
-      <w:numFmt w:val="bullet"/>
-      <w:lvlText w:val="○"/>
-      <w:lvlJc w:val="left"/>
-      <w:pPr>
-        <w:ind w:left="5760" w:hanging="360"/>
-      </w:pPr>
-      <w:rPr>
-        <w:u w:val="none"/>
-      </w:rPr>
-    </w:lvl>
-    <w:lvl w:ilvl="8">
-      <w:start w:val="1"/>
-      <w:numFmt w:val="bullet"/>
-      <w:lvlText w:val="■"/>
       <w:lvlJc w:val="left"/>
       <w:pPr>
         <w:ind w:left="6480" w:hanging="360"/>

</xml_diff>